<commit_message>
feat: make lenses 1 and 3 visual and example-first
</commit_message>
<xml_diff>
--- a/assets/handouts/lens-1-provenance-map.docx
+++ b/assets/handouts/lens-1-provenance-map.docx
@@ -51,19 +51,90 @@
         <w:t xml:space="preserve"> </w:t>
       </w:r>
       <w:r>
-        <w:t xml:space="preserve">Choose a system from a research-use description in your group. Use BLOOM only if no description fits. For each stage, note what is known, what is unknown, and what is avoidable. Note the source of each entry. Mark the largest unknown and one avoidable cost. Complete the sentence:</w:t>
+        <w:t xml:space="preserve">Choose your group’s research use, or use the prepared BLOOM case. Select</w:t>
       </w:r>
       <w:r>
         <w:t xml:space="preserve"> </w:t>
       </w:r>
       <w:r>
+        <w:rPr>
+          <w:b/>
+          <w:bCs/>
+        </w:rPr>
+        <w:t xml:space="preserve">2–3 stages</w:t>
+      </w:r>
+      <w:r>
+        <w:t xml:space="preserve"> </w:t>
+      </w:r>
+      <w:r>
+        <w:t xml:space="preserve">(3 min). Record</w:t>
+      </w:r>
+      <w:r>
+        <w:t xml:space="preserve"> </w:t>
+      </w:r>
+      <w:r>
+        <w:rPr>
+          <w:b/>
+          <w:bCs/>
+        </w:rPr>
+        <w:t xml:space="preserve">Known, Unknown, Avoidable</w:t>
+      </w:r>
+      <w:r>
+        <w:t xml:space="preserve">, with sources (8 min). Mark the largest unknown and one avoidable cost (2 min). Prepare:</w:t>
+      </w:r>
+      <w:r>
+        <w:t xml:space="preserve"> </w:t>
+      </w:r>
+      <w:r>
         <w:t xml:space="preserve">“The choice that the performance of this system hides most is …”</w:t>
       </w:r>
       <w:r>
         <w:t xml:space="preserve"> </w:t>
       </w:r>
       <w:r>
-        <w:t xml:space="preserve">See the</w:t>
+        <w:t xml:space="preserve">(2 min). Write</w:t>
+      </w:r>
+      <w:r>
+        <w:t xml:space="preserve"> </w:t>
+      </w:r>
+      <w:r>
+        <w:rPr>
+          <w:b/>
+          <w:bCs/>
+        </w:rPr>
+        <w:t xml:space="preserve">Unknown</w:t>
+      </w:r>
+      <w:r>
+        <w:t xml:space="preserve"> </w:t>
+      </w:r>
+      <w:r>
+        <w:t xml:space="preserve">for missing evidence. Mark other stages</w:t>
+      </w:r>
+      <w:r>
+        <w:t xml:space="preserve"> </w:t>
+      </w:r>
+      <w:r>
+        <w:rPr>
+          <w:b/>
+          <w:bCs/>
+        </w:rPr>
+        <w:t xml:space="preserve">Not examined</w:t>
+      </w:r>
+      <w:r>
+        <w:t xml:space="preserve">. Label suggested changes</w:t>
+      </w:r>
+      <w:r>
+        <w:t xml:space="preserve"> </w:t>
+      </w:r>
+      <w:r>
+        <w:rPr>
+          <w:b/>
+          <w:bCs/>
+        </w:rPr>
+        <w:t xml:space="preserve">PROPOSED</w:t>
+      </w:r>
+      <w:r>
+        <w:t xml:space="preserve">. See the</w:t>
       </w:r>
       <w:r>
         <w:t xml:space="preserve"> </w:t>
@@ -383,6 +454,11 @@
       </w:tr>
     </w:tbl>
     <w:p>
+      <w:r>
+        <w:br w:type="page"/>
+      </w:r>
+    </w:p>
+    <w:p>
       <w:pPr>
         <w:pStyle w:val="TableCaption"/>
       </w:pPr>
@@ -507,7 +583,7 @@
         <w:pStyle w:val="FirstParagraph"/>
       </w:pPr>
       <w:r>
-        <w:t xml:space="preserve">Carry your main finding over to the twelve shared fields. You use them again in the research-use clinic.</w:t>
+        <w:t xml:space="preserve">Transfer your main finding to the shared fields during the research-use clinic. This step is outside the 15-minute activity.</w:t>
       </w:r>
     </w:p>
     <w:p>
@@ -840,6 +916,8 @@
       <w:footnotePr>
         <w:numRestart w:val="eachSect"/>
       </w:footnotePr>
+      <w:pgSz w:h="11906" w:orient="landscape" w:w="16838"/>
+      <w:pgMar w:bottom="850" w:footer="425" w:gutter="0" w:header="425" w:left="907" w:right="907" w:top="850"/>
     </w:sectPr>
   </w:body>
 </w:document>

</xml_diff>

<commit_message>
feat: make lenses 1 and 3 visual and example-first (#11)
Co-authored-by: Moritz Mähr <14755525+maehr@users.noreply.github.com>
</commit_message>
<xml_diff>
--- a/assets/handouts/lens-1-provenance-map.docx
+++ b/assets/handouts/lens-1-provenance-map.docx
@@ -51,19 +51,90 @@
         <w:t xml:space="preserve"> </w:t>
       </w:r>
       <w:r>
-        <w:t xml:space="preserve">Choose a system from a research-use description in your group. Use BLOOM only if no description fits. For each stage, note what is known, what is unknown, and what is avoidable. Note the source of each entry. Mark the largest unknown and one avoidable cost. Complete the sentence:</w:t>
+        <w:t xml:space="preserve">Choose your group’s research use, or use the prepared BLOOM case. Select</w:t>
       </w:r>
       <w:r>
         <w:t xml:space="preserve"> </w:t>
       </w:r>
       <w:r>
+        <w:rPr>
+          <w:b/>
+          <w:bCs/>
+        </w:rPr>
+        <w:t xml:space="preserve">2–3 stages</w:t>
+      </w:r>
+      <w:r>
+        <w:t xml:space="preserve"> </w:t>
+      </w:r>
+      <w:r>
+        <w:t xml:space="preserve">(3 min). Record</w:t>
+      </w:r>
+      <w:r>
+        <w:t xml:space="preserve"> </w:t>
+      </w:r>
+      <w:r>
+        <w:rPr>
+          <w:b/>
+          <w:bCs/>
+        </w:rPr>
+        <w:t xml:space="preserve">Known, Unknown, Avoidable</w:t>
+      </w:r>
+      <w:r>
+        <w:t xml:space="preserve">, with sources (8 min). Mark the largest unknown and one avoidable cost (2 min). Prepare:</w:t>
+      </w:r>
+      <w:r>
+        <w:t xml:space="preserve"> </w:t>
+      </w:r>
+      <w:r>
         <w:t xml:space="preserve">“The choice that the performance of this system hides most is …”</w:t>
       </w:r>
       <w:r>
         <w:t xml:space="preserve"> </w:t>
       </w:r>
       <w:r>
-        <w:t xml:space="preserve">See the</w:t>
+        <w:t xml:space="preserve">(2 min). Write</w:t>
+      </w:r>
+      <w:r>
+        <w:t xml:space="preserve"> </w:t>
+      </w:r>
+      <w:r>
+        <w:rPr>
+          <w:b/>
+          <w:bCs/>
+        </w:rPr>
+        <w:t xml:space="preserve">Unknown</w:t>
+      </w:r>
+      <w:r>
+        <w:t xml:space="preserve"> </w:t>
+      </w:r>
+      <w:r>
+        <w:t xml:space="preserve">for missing evidence. Mark other stages</w:t>
+      </w:r>
+      <w:r>
+        <w:t xml:space="preserve"> </w:t>
+      </w:r>
+      <w:r>
+        <w:rPr>
+          <w:b/>
+          <w:bCs/>
+        </w:rPr>
+        <w:t xml:space="preserve">Not examined</w:t>
+      </w:r>
+      <w:r>
+        <w:t xml:space="preserve">. Label suggested changes</w:t>
+      </w:r>
+      <w:r>
+        <w:t xml:space="preserve"> </w:t>
+      </w:r>
+      <w:r>
+        <w:rPr>
+          <w:b/>
+          <w:bCs/>
+        </w:rPr>
+        <w:t xml:space="preserve">PROPOSED</w:t>
+      </w:r>
+      <w:r>
+        <w:t xml:space="preserve">. See the</w:t>
       </w:r>
       <w:r>
         <w:t xml:space="preserve"> </w:t>
@@ -383,6 +454,11 @@
       </w:tr>
     </w:tbl>
     <w:p>
+      <w:r>
+        <w:br w:type="page"/>
+      </w:r>
+    </w:p>
+    <w:p>
       <w:pPr>
         <w:pStyle w:val="TableCaption"/>
       </w:pPr>
@@ -507,7 +583,7 @@
         <w:pStyle w:val="FirstParagraph"/>
       </w:pPr>
       <w:r>
-        <w:t xml:space="preserve">Carry your main finding over to the twelve shared fields. You use them again in the research-use clinic.</w:t>
+        <w:t xml:space="preserve">Transfer your main finding to the shared fields during the research-use clinic. This step is outside the 15-minute activity.</w:t>
       </w:r>
     </w:p>
     <w:p>
@@ -840,6 +916,8 @@
       <w:footnotePr>
         <w:numRestart w:val="eachSect"/>
       </w:footnotePr>
+      <w:pgSz w:h="11906" w:orient="landscape" w:w="16838"/>
+      <w:pgMar w:bottom="850" w:footer="425" w:gutter="0" w:header="425" w:left="907" w:right="907" w:top="850"/>
     </w:sectPr>
   </w:body>
 </w:document>

</xml_diff>